<commit_message>
docs(research): rewrite core sections with ABCD and plain explanations
Refs #1, #12, #13, #14, #16. Preserve indirect citations, technical evidence and unresolved academic review.
</commit_message>
<xml_diff>
--- a/paper/projeto-integrador-versao-revisao.docx
+++ b/paper/projeto-integrador-versao-revisao.docx
@@ -63,12 +63,8 @@
       </w:r>
     </w:p>
     <w:p>
-      <w:r>
-        <w:br w:type="page"/>
-      </w:r>
-    </w:p>
-    <w:p>
       <w:pPr>
+        <w:pageBreakBefore/>
         <w:spacing w:before="800"/>
         <w:jc w:val="center"/>
       </w:pPr>
@@ -116,12 +112,8 @@
       </w:r>
     </w:p>
     <w:p>
-      <w:r>
-        <w:br w:type="page"/>
-      </w:r>
-    </w:p>
-    <w:p>
       <w:pPr>
+        <w:pageBreakBefore/>
         <w:spacing w:before="0"/>
         <w:jc w:val="center"/>
       </w:pPr>
@@ -196,7 +188,7 @@
       </w:r>
       <w:fldSimple w:instr="PAGEREF especificos \h">
         <w:r>
-          <w:t>4</w:t>
+          <w:t>5</w:t>
         </w:r>
       </w:fldSimple>
     </w:p>
@@ -303,14 +295,10 @@
       </w:fldSimple>
     </w:p>
     <w:p>
-      <w:r>
-        <w:br w:type="page"/>
-      </w:r>
-    </w:p>
-    <w:p>
       <w:bookmarkStart w:id="1" w:name="intro"/>
       <w:pPr>
         <w:pStyle w:val="Heading1"/>
+        <w:pageBreakBefore/>
         <w:jc w:val="left"/>
       </w:pPr>
       <w:r>
@@ -320,17 +308,22 @@
     </w:p>
     <w:p>
       <w:r>
-        <w:t>Este Projeto Integrador apresenta um demonstrador que relaciona a estrutura de uma classe, o código Java e o estado de seus objetos. O exemplo utiliza contas bancárias para mostrar que uma classe pode originar instâncias com valores independentes e que duas referências podem apontar para o mesmo objeto. O resultado desenvolvido é um recurso técnico de visualização, acompanhado de verificações reproduzíveis.</w:t>
+        <w:t>Relacionar uma classe aos objetos criados durante a execução é o problema técnico deste Projeto Integrador. Kölling et al. (2003) descrevem o BlueJ como um ambiente de ensino que aproxima classes e interação com objetos. No exemplo deste trabalho, a classe BankAccount descreve o que uma conta pode fazer; cada conta criada é um objeto, com seu próprio saldo. Essa distinção orienta a construção de um demonstrador que torna essas relações observáveis.</w:t>
       </w:r>
     </w:p>
     <w:p>
       <w:r>
-        <w:t>O problema abordado é como tornar observável a correspondência entre um membro de classe, sua implementação e a mudança de estado do objeto que recebe uma chamada. A pergunta deste recorte técnico é: como implementar essas correspondências e verificar seu comportamento nos cenários definidos? Essa pergunta pode ser examinada por análise documental e testes de software. O efeito sobre a aprendizagem exige outra avaliação, com participantes, que não foi realizada.</w:t>
+        <w:t>As três vistas do demonstrador apresentam informações diferentes sobre o mesmo exemplo. Ainsworth (2006) propõe considerar o desenho das representações, suas funções e as tarefas necessárias para relacioná-las. Aqui, o cartão UML resume a estrutura, o código mostra como a operação foi escrita e a vista de objetos mostra os valores registrados. O projeto usa destaques para indicar a correspondência entre essas vistas, sem presumir que exibi-las juntas garanta compreensão.</w:t>
       </w:r>
     </w:p>
     <w:p>
       <w:r>
-        <w:t>A proposta dialoga com antecedentes como o BlueJ, que já combina representações de classes e interação com objetos (Kölling et al., 2003). Portanto, não se reivindica a primeira integração entre UML e execução. O interesse do demonstrador está na explicitação das correspondências, na comparação entre duas condições visuais e na preservação das evidências de funcionamento.</w:t>
+        <w:t>A pergunta deste recorte é: como implementar correspondências entre UML, código Java e estado dos objetos e verificar seu funcionamento nos cenários definidos? O demonstrador já permite executar operações e comparar estados antes e depois das chamadas. Por exemplo, um depósito deve alterar o saldo da conta que recebeu a operação, mantendo o saldo de outra instância independente. Esse comportamento pode ser conferido por testes de software com valores conhecidos.</w:t>
+      </w:r>
+    </w:p>
+    <w:p>
+      <w:r>
+        <w:t>O alcance da entrega é técnico e documental. As evidências do projeto identificam verificações de software e nenhum participante na avaliação. Portanto, observar a mudança correta de saldo demonstra o comportamento do cenário exercitado, mas não demonstra que estudantes aprenderam com a ferramenta. O trabalho apresenta a implementação, seus fundamentos e seus limites; a avaliação educacional permanece uma etapa futura.</w:t>
       </w:r>
     </w:p>
     <w:p>
@@ -394,38 +387,34 @@
     </w:p>
     <w:p>
       <w:r>
-        <w:t>O trabalho combina pesquisa bibliográfica exploratória, análise documental de ferramentas e desenvolvimento de um protótipo com verificação técnica. A articulação entre construir e avaliar artefatos se aproxima da perspectiva de Design Science Research apresentada por Hevner et al. (2004). Este recorte não corresponde à conclusão de uma avaliação educacional do artefato.</w:t>
+        <w:t>O trabalho combina levantamento bibliográfico exploratório, análise documental e desenvolvimento com verificação técnica. Hevner et al. (2004) discutem construção e avaliação de artefatos. Aqui, construir é implementar o demonstrador; verificar é comparar o comportamento com resultados esperados. Essa aproximação não conclui a avaliação educacional.</w:t>
       </w:r>
     </w:p>
     <w:p>
       <w:r>
-        <w:t>A etapa bibliográfica consultou publicações e registros institucionais sobre ambientes de aprendizagem de Java e visualização de programas. O levantamento foi exploratório: algumas fontes tiveram seções consultadas, outras apenas resumos e metadados. A busca não foi uma revisão sistemática. O corpus e os limites de leitura estão registrados na matriz de evidências do projeto.</w:t>
+        <w:t>O levantamento reuniu fontes sobre BlueJ, visualização de programas e múltiplas representações, registradas na matriz de evidências. Foram consultadas seções de originais e, em algumas fontes, somente resumos e metadados. Esses materiais orientaram as decisões do demonstrador. A busca exploratória não foi uma revisão sistemática nem comprova novidade ampla.</w:t>
       </w:r>
     </w:p>
     <w:p>
       <w:r>
-        <w:t>Na implementação, utilizou-se a classe BankAccount, com saldo decimal, construtor e métodos de depósito, retirada e consulta. Um executor mantém objetos reais em Java e registra cópias imutáveis dos estados antes e depois das operações. Marcadores delimitam as regiões de fonte associadas aos membros. A interface oferece as condições linked, com destaques de correspondência, e plain, sem esses destaques, utilizando o mesmo executor.</w:t>
+        <w:t>A implementação utiliza BankAccount, com saldo decimal, depósito, retirada e consulta. Os arquivos-fonte mostram um executor com objetos reais em Java e registros anteriores e posteriores às chamadas. Assim, conserva-se o estado de antes e de depois da operação. Marcadores relacionam membros a regiões de código, sem rastrear cada instrução ou aceitar Java arbitrário.</w:t>
       </w:r>
     </w:p>
     <w:p>
       <w:r>
-        <w:t>A verificação empregou valores conhecidos e cenários determinísticos, sem participantes. Foram compilados o exemplo executável e um esqueleto gerado separadamente. Os testes conferiram identidade de objetos, independência entre instâncias, referências compartilhadas, valores decimais, rejeição de operações inválidas, equivalência do executor e registro de respostas. Uma execução adicional acionou a interface em display virtual e conferiu a exportação local.</w:t>
+        <w:t>A verificação usa cenários com valores conhecidos. No teste gráfico preservado, uma conta passa de 100 para 125 após receber 25, enquanto outra mantém 20. Também foram conferidas referências compartilhadas, rejeições, equivalência do executor e exportação, conforme o Apêndice A. Cada aprovação sustenta apenas o comportamento exercitado.</w:t>
       </w:r>
     </w:p>
     <w:p>
       <w:r>
-        <w:t>As evidências foram interpretadas segundo o comportamento esperado de cada cenário. Passar em um teste sustenta apenas a afirmação correspondente ao cenário exercitado; não demonstra correção para todos os programas, facilidade de uso, aprendizagem ou potencial de venda. Fontes, versões, logs e hashes estão preservados no repositório público do projeto. Os procedimentos e resultados estão resumidos no Apêndice A.</w:t>
-      </w:r>
-    </w:p>
-    <w:p>
-      <w:r>
-        <w:br w:type="page"/>
+        <w:t>Os logs e resultados identificam as versões verificadas. A execução inicial registrou 28 verificações Java e cinco testes Python aprovados; outra incluiu nove verificações gráficas aprovadas, com zero participantes. Esses números contam testes do programa, não alunos. Aprendizagem, usabilidade e interesse comercial permanecem sem avaliação própria.</w:t>
       </w:r>
     </w:p>
     <w:p>
       <w:bookmarkStart w:id="6" w:name="teoria"/>
       <w:pPr>
         <w:pStyle w:val="Heading1"/>
+        <w:pageBreakBefore/>
         <w:jc w:val="left"/>
       </w:pPr>
       <w:r>
@@ -439,17 +428,17 @@
         <w:jc w:val="left"/>
       </w:pPr>
       <w:r>
-        <w:t>2.1 Classes objetos e representações relacionadas</w:t>
+        <w:t>2.1 Classes objetos e referências</w:t>
       </w:r>
     </w:p>
     <w:p>
       <w:r>
-        <w:t>Uma classe descreve a estrutura e os comportamentos de seus objetos. O estado pertence a cada instância; uma referência permite acessar um objeto e não deve ser confundida com ele. No exemplo adotado, criar duas contas com saldos distintos permite observar a independência dos estados. Criar um segundo nome para a mesma conta permite observar referências compartilhadas. Essas situações orientam a escolha do exemplo e os testes do demonstrador.</w:t>
+        <w:t>A distinção entre classe e objeto orienta o exemplo adotado. Kölling et al. (2003) descrevem recursos do BlueJ que permitem criar objetos e interagir com eles. Para acompanhar o demonstrador, basta distinguir três elementos: a classe descreve a estrutura e as operações, o objeto é uma conta criada e o estado é o conjunto de valores dessa conta. Assim, duas contas da mesma classe podem ter saldos diferentes sem contradição.</w:t>
       </w:r>
     </w:p>
     <w:p>
       <w:r>
-        <w:t>O BlueJ oferece um antecedente relevante para essa aproximação entre estrutura e interação. Kölling et al. (2003) descrevem um ambiente voltado à aprendizagem de orientação a objetos, com representação de classes e interação direta com objetos. Esse antecedente impede atribuir novidade ampla à simples presença de um diagrama e de execução em uma mesma ferramenta. A comparação aqui é documental, sem ensaio instalado de desempenho ou usabilidade entre produtos.</w:t>
+        <w:t>Uma referência permite acessar um objeto e não deve ser confundida com ele. Os testes do projeto distinguem instâncias independentes de referências compartilhadas. Dois nomes podem apontar para a mesma conta; nesse caso, consultar qualquer um deles revela a mudança realizada no único objeto. Esse exemplo explica por que contar nomes não basta para contar objetos e por que a identidade precisa ser verificada.</w:t>
       </w:r>
     </w:p>
     <w:p>
@@ -458,17 +447,17 @@
         <w:jc w:val="left"/>
       </w:pPr>
       <w:r>
-        <w:t>2.2 Múltiplas representações e atividades de compreensão</w:t>
+        <w:t>2.2 Como relacionar as representações</w:t>
       </w:r>
     </w:p>
     <w:p>
       <w:r>
-        <w:t>Ainsworth (2006) propõe o framework DeFT para considerar o desenho, as funções e as tarefas cognitivas envolvidas no uso de múltiplas representações. Sua contribuição para este projeto é orientar a relação entre as vistas: o cartão estrutural indica os membros, o código mostra a implementação e os estados mostram os valores dos objetos. A seleção de um membro e a execução de um método evidenciam correspondências entre essas informações.</w:t>
+        <w:t>Relacionar as vistas faz parte da tarefa de compreender o exemplo. Ainsworth (2006) examina fatores que influenciam o uso de múltiplas representações e as tarefas necessárias para interpretá-las. No demonstrador, a pergunta concreta é qual trecho do código e qual objeto correspondem ao método selecionado no cartão UML. Os destaques foram projetados para indicar essa relação; sua utilidade educacional ainda precisa ser avaliada.</w:t>
       </w:r>
     </w:p>
     <w:p>
       <w:r>
-        <w:t>A disponibilização simultânea de informações não comprova que o estudante compreendeu a relação entre elas. O demonstrador inclui campos para prever uma mudança e explicar o resultado observado. A síntese de estudos de visualização de algoritmos de Hundhausen, Douglas e Stasko (2002) oferece fundamento para considerar as atividades realizadas com a visualização. A aplicação desse argumento ao exemplo de objetos é uma decisão de projeto que ainda requer avaliação educacional própria.</w:t>
+        <w:t>A atividade realizada com a visualização também merece atenção. Hundhausen, Douglas e Stasko (2002), em uma síntese de estudos de visualização de algoritmos, discutem a importância do modo como os estudantes utilizam esses recursos. O demonstrador permite registrar uma previsão, executar uma operação e explicar o que mudou. Essa sequência é uma decisão de projeto inspirada na literatura, sem transferência automática dos resultados daqueles estudos para esta ferramenta.</w:t>
       </w:r>
     </w:p>
     <w:p>
@@ -477,17 +466,17 @@
         <w:jc w:val="left"/>
       </w:pPr>
       <w:r>
-        <w:t>2.3 Visualização dinâmica e limites da contribuição</w:t>
+        <w:t>2.3 Antecedentes e contribuição delimitada</w:t>
       </w:r>
     </w:p>
     <w:p>
       <w:r>
-        <w:t>Moreno et al. (2004) apresentam o Jeliot 3 como ferramenta de visualização de programas. Gestwicki e Jayaraman (2004) descrevem o JIVE, relacionado à visualização da execução em Java. Esses antecedentes reforçam que a representação visual do comportamento de programas já integra uma linha de desenvolvimento existente. O demonstrador deste trabalho não substitui a análise dessas ferramentas nem prova ausência de funcionalidades semelhantes nelas.</w:t>
+        <w:t>A visualização da execução de programas possui antecedentes. Moreno et al. (2004) apresentam o Jeliot 3, e Gestwicki e Jayaraman (2004) descrevem o JIVE, associado à visualização em Java. Essas descrições situam o demonstrador em uma área já existente. Portanto, a contribuição candidata deve ser examinada por suas escolhas específicas e evidências, sem anunciar uma integração inédita apenas por reunir diagrama e execução.</w:t>
       </w:r>
     </w:p>
     <w:p>
       <w:r>
-        <w:t>O recurso implementado é restrito a um exemplo de conta bancária. Na condição linked, a seleção de um membro destaca sua região de código e a operação evidencia as referências afetadas. Na condição plain, os estados e as operações permanecem os mesmos, sem o apoio visual adicional. Essa separação torna possível planejar uma comparação futura, embora a existência das duas condições não constitua, por si, um experimento com estudantes.</w:t>
+        <w:t>A escolha específica implementada é oferecer duas condições visuais sobre o mesmo executor. Os fontes e testes preservados mostram as condições linked, com destaques, e plain, sem esse apoio adicional. Em termos simples, muda a indicação visual de correspondência, enquanto as operações e os estados esperados permanecem equivalentes nos cenários testados. Essa organização prepara uma comparação futura, mas não constitui um estudo realizado com estudantes.</w:t>
       </w:r>
     </w:p>
     <w:p>
@@ -496,28 +485,24 @@
         <w:jc w:val="left"/>
       </w:pPr>
       <w:r>
-        <w:t>2.4 Construção avaliação e comunicação do produto</w:t>
+        <w:t>2.4 Evidências e alcance das afirmações</w:t>
       </w:r>
     </w:p>
     <w:p>
       <w:r>
-        <w:t>Hevner et al. (2004) articulam a construção e a avaliação de artefatos em Sistemas de Informação. Para o presente trabalho, essa perspectiva orienta a necessidade de declarar qual problema o recurso aborda e quais evidências foram obtidas. O protótipo e seus testes sustentam um resultado técnico delimitado. Afirmar melhoria de aprendizagem, utilidade percebida ou interesse comercial demandaria evidências adicionais.</w:t>
+        <w:t>A avaliação deve corresponder ao resultado que se pretende afirmar. Hevner et al. (2004) discutem a avaliação de artefatos no contexto de pesquisa em Sistemas de Informação. Aqui, conferir que uma conta passa de 100 para 125 verifica uma operação; verificar aprendizagem exigiria observar a compreensão de pessoas por um procedimento adequado. Essa diferença delimita a interpretação dos resultados disponíveis.</w:t>
       </w:r>
     </w:p>
     <w:p>
       <w:r>
-        <w:t>Uma comunicação compatível com o resultado demonstrado pode apresentar o recurso como uma forma de visualizar relações entre classe, código e mudanças de estado em objetos Java. Não seria justificável anunciar aprendizagem comprovada, geração automática de lógica de negócio, suporte a Java arbitrário ou integração inédita. A pesquisa de demanda e a avaliação de disposição a pagar permanecem etapas distintas da verificação funcional.</w:t>
-      </w:r>
-    </w:p>
-    <w:p>
-      <w:r>
-        <w:br w:type="page"/>
+        <w:t>A comunicação do software deve acompanhar esse alcance. Os registros técnicos comprovam comportamentos exercitados em um exemplo restrito, sem dados de aprendizagem ou de vendas. Por isso, é possível apresentar o recurso como um demonstrador de relações entre classe, código e estado de objetos Java. Afirmar que ele melhora notas, garante compreensão ou tem demanda comercial dependeria de novas evidências.</w:t>
       </w:r>
     </w:p>
     <w:p>
       <w:bookmarkStart w:id="7" w:name="fim"/>
       <w:pPr>
         <w:pStyle w:val="Heading1"/>
+        <w:pageBreakBefore/>
         <w:jc w:val="left"/>
       </w:pPr>
       <w:r>
@@ -527,33 +512,29 @@
     </w:p>
     <w:p>
       <w:r>
-        <w:t>O objetivo técnico foi desenvolvido mediante um demonstrador que relaciona uma representação estrutural UML, regiões de fonte Java e estados de objetos reais. A primeira verificação preservada apresentou 28 verificações Java e cinco testes Python aprovados. Em uma execução posterior, nove verificações de interface e exportação também foram aprovadas. O Apêndice A identifica as versões e as execuções, permitindo conferir o alcance desses resultados.</w:t>
+        <w:t>Foi desenvolvido um demonstrador que relaciona uma representação estrutural UML, regiões do código Java e estados de objetos. As evidências preservadas registram 28 verificações Java e cinco testes Python aprovados na execução inicial, além de nove verificações gráficas em uma versão posterior. Esses resultados permitem responder à pergunta técnica dentro dos cenários definidos. O Apêndice A identifica as versões, as execuções e os arquivos que permitem conferir essa resposta.</w:t>
       </w:r>
     </w:p>
     <w:p>
       <w:r>
-        <w:t>Os cenários verificados mostram que depositar em uma conta não altera uma instância independente e que referências compartilhadas observam a mudança do mesmo objeto. Também foram conferidos registros de estado e a equivalência dos comportamentos entre as duas condições visuais. Isso responde à pergunta técnica dentro dos exemplos exercitados, sem demonstrar efeito sobre a aprendizagem.</w:t>
+        <w:t>O exemplo central torna o resultado concreto: uma conta com saldo 100 recebe um depósito de 25 e passa a 125, enquanto outra instância mantém 20. Os testes também diferenciam duas referências para o mesmo objeto de duas instâncias independentes. Assim, o demonstrador torna observáveis relações que o texto e o código descrevem de formas diferentes. O resultado comprovado é o comportamento técnico exercitado, sem inferência de aprendizagem.</w:t>
       </w:r>
     </w:p>
     <w:p>
       <w:r>
-        <w:t>A análise bibliográfica identificou antecedentes que impedem tratar a simples união de diagrama e objetos como contribuição inédita. O resultado deve ser apresentado como um demonstrador restrito, com correspondências explícitas e evidências rastreáveis. Os objetivos de identificar fundamentos e implementar cenários foram operacionalizados; a revisão crítica aprofundada e a avaliação educacional do programa de pesquisa mais amplo permanecem em andamento.</w:t>
+        <w:t>A análise dos antecedentes impede apresentar a simples reunião de diagrama e execução como novidade ampla. A descrição do BlueJ por Kölling et al. (2003) já inclui classes e interação com objetos. O demonstrador deste projeto deve ser examinado pelas correspondências explícitas, pelas duas condições visuais e pela rastreabilidade de seus testes. Essa delimitação permite comunicar o que foi construído sem atribuir ao projeto resultados que pertencem à literatura ou que ainda não foram obtidos.</w:t>
       </w:r>
     </w:p>
     <w:p>
       <w:r>
-        <w:t>Entre as limitações estão o uso de uma única classe, o mapeamento baseado em marcadores e a ausência de avaliação humana de usabilidade ou aprendizagem. O protótipo não é um editor UML geral e não executa qualquer programa Java. Como continuidade, propõe-se revisar os instrumentos, confirmar as condições institucionais e realizar um estudo adequado antes de afirmar ganho educacional. A demanda comercial também deve ser investigada por procedimentos próprios.</w:t>
-      </w:r>
-    </w:p>
-    <w:p>
-      <w:r>
-        <w:br w:type="page"/>
+        <w:t>Permanecem limites importantes: uma classe de exemplo, mapeamento por marcadores e ausência de avaliação humana de usabilidade e aprendizagem. Os registros técnicos informam zero participantes, portanto não permitem responder se estudantes compreenderiam melhor os conceitos. A continuidade requer revisão das fontes e dos instrumentos, confirmação das condições institucionais e avaliação apropriada. Essas etapas permitirão examinar a utilidade educacional sem confundi-la com a funcionalidade demonstrada.</w:t>
       </w:r>
     </w:p>
     <w:p>
       <w:bookmarkStart w:id="8" w:name="refs"/>
       <w:pPr>
         <w:pStyle w:val="Heading1"/>
+        <w:pageBreakBefore/>
         <w:jc w:val="left"/>
       </w:pPr>
       <w:r>
@@ -610,14 +591,10 @@
       </w:r>
     </w:p>
     <w:p>
-      <w:r>
-        <w:br w:type="page"/>
-      </w:r>
-    </w:p>
-    <w:p>
       <w:bookmarkStart w:id="9" w:name="apendice"/>
       <w:pPr>
         <w:pStyle w:val="Heading1"/>
+        <w:pageBreakBefore/>
         <w:jc w:val="left"/>
       </w:pPr>
       <w:r>
@@ -674,14 +651,10 @@
       </w:r>
     </w:p>
     <w:p>
-      <w:r>
-        <w:br w:type="page"/>
-      </w:r>
-    </w:p>
-    <w:p>
       <w:bookmarkStart w:id="10" w:name="anexos"/>
       <w:pPr>
         <w:pStyle w:val="Heading1"/>
+        <w:pageBreakBefore/>
         <w:jc w:val="left"/>
       </w:pPr>
       <w:r>

</xml_diff>

<commit_message>
docs(research): simplify course draft and use 2021–2026 evidence
Refs #1, #3, #12, #13, #14, #16. Record search scope, source access limits and indirect citations.
</commit_message>
<xml_diff>
--- a/paper/projeto-integrador-versao-revisao.docx
+++ b/paper/projeto-integrador-versao-revisao.docx
@@ -45,7 +45,7 @@
         <w:jc w:val="center"/>
       </w:pPr>
       <w:r>
-        <w:t>CORRESPONDÊNCIAS ENTRE UML CÓDIGO JAVA E ESTADO DE OBJETOS</w:t>
+        <w:t>FERRAMENTA VISUAL PARA ACOMPANHAR OBJETOS EM PROGRAMAS JAVA</w:t>
       </w:r>
     </w:p>
     <w:p>
@@ -94,7 +94,7 @@
         <w:jc w:val="center"/>
       </w:pPr>
       <w:r>
-        <w:t>CORRESPONDÊNCIAS ENTRE UML CÓDIGO JAVA E ESTADO DE OBJETOS</w:t>
+        <w:t>FERRAMENTA VISUAL PARA ACOMPANHAR OBJETOS EM PROGRAMAS JAVA</w:t>
       </w:r>
     </w:p>
     <w:p>
@@ -188,7 +188,7 @@
       </w:r>
       <w:fldSimple w:instr="PAGEREF especificos \h">
         <w:r>
-          <w:t>5</w:t>
+          <w:t>4</w:t>
         </w:r>
       </w:fldSimple>
     </w:p>
@@ -308,22 +308,17 @@
     </w:p>
     <w:p>
       <w:r>
-        <w:t>Relacionar uma classe aos objetos criados durante a execução é o problema técnico deste Projeto Integrador. Kölling et al. (2003) descrevem o BlueJ como um ambiente de ensino que aproxima classes e interação com objetos. No exemplo deste trabalho, a classe BankAccount descreve o que uma conta pode fazer; cada conta criada é um objeto, com seu próprio saldo. Essa distinção orienta a construção de um demonstrador que torna essas relações observáveis.</w:t>
+        <w:t>Este Projeto Integrador apresenta uma ferramenta visual para acompanhar o que um programa faz com os dados. O exemplo usa duas contas fictícias, sem dinheiro real ou dados pessoais. Lu e Alexandru (2023) analisam ferramentas de diagramas para o ensino de desenvolvimento de programas. Neste trabalho, o desenho ajuda a apresentar a estrutura da conta; as demais partes da tela mostram as instruções escritas em Java e os valores das contas.</w:t>
       </w:r>
     </w:p>
     <w:p>
       <w:r>
-        <w:t>As três vistas do demonstrador apresentam informações diferentes sobre o mesmo exemplo. Ainsworth (2006) propõe considerar o desenho das representações, suas funções e as tarefas necessárias para relacioná-las. Aqui, o cartão UML resume a estrutura, o código mostra como a operação foi escrita e a vista de objetos mostra os valores registrados. O projeto usa destaques para indicar a correspondência entre essas vistas, sem presumir que exibi-las juntas garanta compreensão.</w:t>
+        <w:t>Java é a linguagem usada para escrever as instruções do exemplo. Cada conta criada pelo programa é chamada de objeto; seu saldo é um dos dados guardados nela. Rexigel et al. (2024) apontam que combinar diferentes formas de apresentar um conteúdo pode trazer benefícios em certas condições, especialmente quando existe apoio para relacioná-las. Por isso, a ferramenta destaca a relação entre desenho, instruções e valores, sem presumir que esses destaques garantam aprendizagem.</w:t>
       </w:r>
     </w:p>
     <w:p>
       <w:r>
-        <w:t>A pergunta deste recorte é: como implementar correspondências entre UML, código Java e estado dos objetos e verificar seu funcionamento nos cenários definidos? O demonstrador já permite executar operações e comparar estados antes e depois das chamadas. Por exemplo, um depósito deve alterar o saldo da conta que recebeu a operação, mantendo o saldo de outra instância independente. Esse comportamento pode ser conferido por testes de software com valores conhecidos.</w:t>
-      </w:r>
-    </w:p>
-    <w:p>
-      <w:r>
-        <w:t>O alcance da entrega é técnico e documental. As evidências do projeto identificam verificações de software e nenhum participante na avaliação. Portanto, observar a mudança correta de saldo demonstra o comportamento do cenário exercitado, mas não demonstra que estudantes aprenderam com a ferramenta. O trabalho apresenta a implementação, seus fundamentos e seus limites; a avaliação educacional permanece uma etapa futura.</w:t>
+        <w:t>A pergunta do trabalho é: como construir uma ferramenta que mostre a relação entre as instruções de um programa e a mudança dos dados de contas de exemplo, e como conferir seu funcionamento? Um caso simples orienta essa pergunta: uma conta começa com 100, recebe 25 e deve passar a 125, enquanto a outra mantém seu valor. Os registros dos testes permitem conferir esse comportamento. O resultado disponível é uma demonstração de funcionamento; ainda não houve avaliação com estudantes.</w:t>
       </w:r>
     </w:p>
     <w:p>
@@ -350,7 +345,7 @@
     </w:p>
     <w:p>
       <w:r>
-        <w:t>Desenvolver e verificar um demonstrador de correspondências entre uma representação estrutural UML, o código Java e o estado de objetos em cenários delimitados de orientação a objetos.</w:t>
+        <w:t>Desenvolver e verificar uma ferramenta visual que mostre como as instruções de um programa Java alteram os dados de contas de exemplo.</w:t>
       </w:r>
     </w:p>
     <w:p>
@@ -366,12 +361,12 @@
     </w:p>
     <w:p>
       <w:r>
-        <w:t>Identificar fundamentos e recursos de ferramentas relacionadas para justificar as correspondências propostas entre classe, código e instâncias.</w:t>
+        <w:t>Relacionar estudos recentes sobre diagramas e visualização de programas às escolhas da ferramenta.</w:t>
       </w:r>
     </w:p>
     <w:p>
       <w:r>
-        <w:t>Implementar e verificar os cenários de instâncias independentes, referências compartilhadas e mudanças de estado, registrando os resultados técnicos e suas limitações.</w:t>
+        <w:t>Implementar e testar situações de alteração e compartilhamento de dados, registrando os resultados e os limites observados.</w:t>
       </w:r>
     </w:p>
     <w:p>
@@ -387,27 +382,22 @@
     </w:p>
     <w:p>
       <w:r>
-        <w:t>O trabalho combina levantamento bibliográfico exploratório, análise documental e desenvolvimento com verificação técnica. Hevner et al. (2004) discutem construção e avaliação de artefatos. Aqui, construir é implementar o demonstrador; verificar é comparar o comportamento com resultados esperados. Essa aproximação não conclui a avaliação educacional.</w:t>
+        <w:t>O trabalho reuniu consulta a publicações, análise de ferramentas descritas nessas fontes, construção do programa e testes de funcionamento. Johannesson e Perjons (2021) apresentam um roteiro de pesquisa que distingue definir o problema, estabelecer requisitos, desenvolver, demonstrar e avaliar uma solução. Aqui, isso significa decidir o que a ferramenta deve mostrar e conferir se ela realiza as operações previstas. Essa aproximação não equivale a comprovar seu valor educacional.</w:t>
       </w:r>
     </w:p>
     <w:p>
       <w:r>
-        <w:t>O levantamento reuniu fontes sobre BlueJ, visualização de programas e múltiplas representações, registradas na matriz de evidências. Foram consultadas seções de originais e, em algumas fontes, somente resumos e metadados. Esses materiais orientaram as decisões do demonstrador. A busca exploratória não foi uma revisão sistemática nem comprova novidade ampla.</w:t>
+        <w:t>A busca bibliográfica foi exploratória, com recorte de publicações de 2016 até 18 de outubro de 2026 e prioridade para 2021–2026. Foram selecionadas cinco fontes de 2021, 2023, 2024 e 2026 sobre visualização, diagramas e método de pesquisa. Consultaram-se os trechos acessíveis e os resumos identificados no registro de fontes. Não se realizou uma revisão sistemática nem leitura integral de todas as obras.</w:t>
       </w:r>
     </w:p>
     <w:p>
       <w:r>
-        <w:t>A implementação utiliza BankAccount, com saldo decimal, depósito, retirada e consulta. Os arquivos-fonte mostram um executor com objetos reais em Java e registros anteriores e posteriores às chamadas. Assim, conserva-se o estado de antes e de depois da operação. Marcadores relacionam membros a regiões de código, sem rastrear cada instrução ou aceitar Java arbitrário.</w:t>
+        <w:t>Na construção, foram usadas contas fictícias para representar objetos, isto é, elementos que o programa cria e cujos dados pode alterar. A tela reúne um desenho da estrutura da conta, as instruções escritas e os saldos registrados. Existem duas versões de apresentação: uma acrescenta destaques que relacionam essas partes e a outra omite os destaques. Ambas usam as mesmas operações, o que permite conferir seu comportamento e preparar uma comparação futura.</w:t>
       </w:r>
     </w:p>
     <w:p>
       <w:r>
-        <w:t>A verificação usa cenários com valores conhecidos. No teste gráfico preservado, uma conta passa de 100 para 125 após receber 25, enquanto outra mantém 20. Também foram conferidas referências compartilhadas, rejeições, equivalência do executor e exportação, conforme o Apêndice A. Cada aprovação sustenta apenas o comportamento exercitado.</w:t>
-      </w:r>
-    </w:p>
-    <w:p>
-      <w:r>
-        <w:t>Os logs e resultados identificam as versões verificadas. A execução inicial registrou 28 verificações Java e cinco testes Python aprovados; outra incluiu nove verificações gráficas aprovadas, com zero participantes. Esses números contam testes do programa, não alunos. Aprendizagem, usabilidade e interesse comercial permanecem sem avaliação própria.</w:t>
+        <w:t>Os testes compararam valores esperados e observados. O caso de depósito verificou a passagem de 100 para 125 e a manutenção de 20 na outra conta. Também foram conferidos dois nomes para a mesma conta, operações que devem ser recusadas e a gravação dos registros em arquivo. A execução inicial aprovou 28 verificações Java e cinco testes do gerador; outra aprovou nove verificações da tela. O Apêndice A identifica essas evidências. Nenhum desses números representa quantidade de estudantes.</w:t>
       </w:r>
     </w:p>
     <w:p>
@@ -428,17 +418,17 @@
         <w:jc w:val="left"/>
       </w:pPr>
       <w:r>
-        <w:t>2.1 Classes objetos e referências</w:t>
+        <w:t>2.1 Desenhos e instruções sobre o mesmo exemplo</w:t>
       </w:r>
     </w:p>
     <w:p>
       <w:r>
-        <w:t>A distinção entre classe e objeto orienta o exemplo adotado. Kölling et al. (2003) descrevem recursos do BlueJ que permitem criar objetos e interagir com eles. Para acompanhar o demonstrador, basta distinguir três elementos: a classe descreve a estrutura e as operações, o objeto é uma conta criada e o estado é o conjunto de valores dessa conta. Assim, duas contas da mesma classe podem ter saldos diferentes sem contradição.</w:t>
+        <w:t>Apresentar a mesma situação de mais de uma forma pode apoiar sua compreensão, mas exige cuidado. Rexigel et al. (2024), ao reunir estudos de educação em ciências, tecnologia, engenharia e matemática, encontraram benefícios condicionados à forma de apoio oferecida. No projeto, o desenho resume o que uma conta contém, as instruções mostram a operação e os saldos mostram seu resultado. Essa aplicação é uma escolha de desenvolvimento, não uma reprodução dos resultados daqueles estudos.</w:t>
       </w:r>
     </w:p>
     <w:p>
       <w:r>
-        <w:t>Uma referência permite acessar um objeto e não deve ser confundida com ele. Os testes do projeto distinguem instâncias independentes de referências compartilhadas. Dois nomes podem apontar para a mesma conta; nesse caso, consultar qualquer um deles revela a mudança realizada no único objeto. Esse exemplo explica por que contar nomes não basta para contar objetos e por que a identidade precisa ser verificada.</w:t>
+        <w:t>O desenho segue uma notação chamada UML, usada para representar partes de um programa. Lu e Alexandru (2023) estudam ferramentas dessa notação para cursos superiores e discutem recursos de elaboração de diagramas e colaboração. Aqui, o desenho é limitado a uma conta de exemplo e suas operações. A fonte ajuda a situar essa escolha entre ferramentas existentes; não demonstra que o nosso recurso seja inédito ou superior.</w:t>
       </w:r>
     </w:p>
     <w:p>
@@ -447,17 +437,17 @@
         <w:jc w:val="left"/>
       </w:pPr>
       <w:r>
-        <w:t>2.2 Como relacionar as representações</w:t>
+        <w:t>2.2 O que o leitor precisa distinguir</w:t>
       </w:r>
     </w:p>
     <w:p>
       <w:r>
-        <w:t>Relacionar as vistas faz parte da tarefa de compreender o exemplo. Ainsworth (2006) examina fatores que influenciam o uso de múltiplas representações e as tarefas necessárias para interpretá-las. No demonstrador, a pergunta concreta é qual trecho do código e qual objeto correspondem ao método selecionado no cartão UML. Os destaques foram projetados para indicar essa relação; sua utilidade educacional ainda precisa ser avaliada.</w:t>
+        <w:t>Para entender o exemplo, é suficiente começar por três ideias: descrição, conta criada e valor guardado. A descrição reúne os dados e as operações possíveis; cada conta criada é um objeto; o saldo é um valor desse objeto. Nos testes do projeto, duas contas separadas conservam saldos independentes. Assim, alterar uma conta não deve mudar a outra.</w:t>
       </w:r>
     </w:p>
     <w:p>
       <w:r>
-        <w:t>A atividade realizada com a visualização também merece atenção. Hundhausen, Douglas e Stasko (2002), em uma síntese de estudos de visualização de algoritmos, discutem a importância do modo como os estudantes utilizam esses recursos. O demonstrador permite registrar uma previsão, executar uma operação e explicar o que mudou. Essa sequência é uma decisão de projeto inspirada na literatura, sem transferência automática dos resultados daqueles estudos para esta ferramenta.</w:t>
+        <w:t>Também pode haver dois nomes para a mesma conta. Nesse caso, não existem duas contas separadas: consultar qualquer um dos nomes permite observar o saldo do mesmo objeto. Os testes verificam essa situação e a comparam com a criação de contas independentes. Esse contraste torna a explicação concreta e delimita o comportamento que a ferramenta apresenta.</w:t>
       </w:r>
     </w:p>
     <w:p>
@@ -466,17 +456,17 @@
         <w:jc w:val="left"/>
       </w:pPr>
       <w:r>
-        <w:t>2.3 Antecedentes e contribuição delimitada</w:t>
+        <w:t>2.3 Por que a utilidade precisa ser investigada</w:t>
       </w:r>
     </w:p>
     <w:p>
       <w:r>
-        <w:t>A visualização da execução de programas possui antecedentes. Moreno et al. (2004) apresentam o Jeliot 3, e Gestwicki e Jayaraman (2004) descrevem o JIVE, associado à visualização em Java. Essas descrições situam o demonstrador em uma área já existente. Portanto, a contribuição candidata deve ser examinada por suas escolhas específicas e evidências, sem anunciar uma integração inédita apenas por reunir diagrama e execução.</w:t>
+        <w:t>Mostrar várias partes de um programa na tela não garante que todas sejam utilizadas. Sibia et al. (2026) investigaram o uso de visualizações por universitários que já haviam cursado disciplinas introdutórias e identificaram diferenças nas formas de recorrer a esses apoios. Isso orienta uma pergunta para o nosso projeto: os destaques seriam úteis ao público pretendido? Como esse público ainda não foi avaliado, a resposta permanece aberta.</w:t>
       </w:r>
     </w:p>
     <w:p>
       <w:r>
-        <w:t>A escolha específica implementada é oferecer duas condições visuais sobre o mesmo executor. Os fontes e testes preservados mostram as condições linked, com destaques, e plain, sem esse apoio adicional. Em termos simples, muda a indicação visual de correspondência, enquanto as operações e os estados esperados permanecem equivalentes nos cenários testados. Essa organização prepara uma comparação futura, mas não constitui um estudo realizado com estudantes.</w:t>
+        <w:t>Os resultados de outras pesquisas também não são uniformes. Yusuf e Noor (2023), em um mapeamento sobre animação de programas, relatam resultados variados e maior concentração de estudos no ensino superior. Portanto, um resultado favorável em outro curso não pode ser tratado como resultado deste Projeto Integrador. Será necessário observar o uso da ferramenta no contexto em que ela venha a ser aplicada.</w:t>
       </w:r>
     </w:p>
     <w:p>
@@ -485,17 +475,17 @@
         <w:jc w:val="left"/>
       </w:pPr>
       <w:r>
-        <w:t>2.4 Evidências e alcance das afirmações</w:t>
+        <w:t>2.4 Funcionamento e aprendizagem são resultados distintos</w:t>
       </w:r>
     </w:p>
     <w:p>
       <w:r>
-        <w:t>A avaliação deve corresponder ao resultado que se pretende afirmar. Hevner et al. (2004) discutem a avaliação de artefatos no contexto de pesquisa em Sistemas de Informação. Aqui, conferir que uma conta passa de 100 para 125 verifica uma operação; verificar aprendizagem exigiria observar a compreensão de pessoas por um procedimento adequado. Essa diferença delimita a interpretação dos resultados disponíveis.</w:t>
+        <w:t>Demonstrar uma solução e avaliar seus resultados são atividades que precisam ser explicitadas. Johannesson e Perjons (2021) distinguem essas atividades em seu roteiro de pesquisa. Neste trabalho, conferir que 100 mais 25 resulta em 125 mostra o funcionamento de uma operação. Para investigar aprendizagem, seria preciso verificar o que as pessoas conseguem explicar ou fazer após usar a ferramenta.</w:t>
       </w:r>
     </w:p>
     <w:p>
       <w:r>
-        <w:t>A comunicação do software deve acompanhar esse alcance. Os registros técnicos comprovam comportamentos exercitados em um exemplo restrito, sem dados de aprendizagem ou de vendas. Por isso, é possível apresentar o recurso como um demonstrador de relações entre classe, código e estado de objetos Java. Afirmar que ele melhora notas, garante compreensão ou tem demanda comercial dependeria de novas evidências.</w:t>
+        <w:t>A apresentação pública do programa deve acompanhar as evidências obtidas. Os registros disponíveis mostram testes de funcionamento, sem avaliação com estudantes e sem pesquisa de vendas. É possível apresentar o recurso como uma ferramenta visual para acompanhar contas de exemplo. Afirmar que ele melhora notas ou desperta interesse de compra dependeria de dados que ainda não foram coletados.</w:t>
       </w:r>
     </w:p>
     <w:p>
@@ -512,22 +502,22 @@
     </w:p>
     <w:p>
       <w:r>
-        <w:t>Foi desenvolvido um demonstrador que relaciona uma representação estrutural UML, regiões do código Java e estados de objetos. As evidências preservadas registram 28 verificações Java e cinco testes Python aprovados na execução inicial, além de nove verificações gráficas em uma versão posterior. Esses resultados permitem responder à pergunta técnica dentro dos cenários definidos. O Apêndice A identifica as versões, as execuções e os arquivos que permitem conferir essa resposta.</w:t>
+        <w:t>Foi construída uma ferramenta que relaciona o desenho de uma conta, as instruções de um programa Java e os valores registrados durante seu funcionamento. Os testes preservados conferem operações específicas, como alterar uma conta sem mudar outra conta separada. Isso responde à pergunta técnica dentro do exemplo desenvolvido. O trabalho ainda não responde se a ferramenta facilita a aprendizagem.</w:t>
       </w:r>
     </w:p>
     <w:p>
       <w:r>
-        <w:t>O exemplo central torna o resultado concreto: uma conta com saldo 100 recebe um depósito de 25 e passa a 125, enquanto outra instância mantém 20. Os testes também diferenciam duas referências para o mesmo objeto de duas instâncias independentes. Assim, o demonstrador torna observáveis relações que o texto e o código descrevem de formas diferentes. O resultado comprovado é o comportamento técnico exercitado, sem inferência de aprendizagem.</w:t>
+        <w:t>O principal resultado pode ser explicado sem conhecer programação: quando uma conta com 100 recebe 25, seu saldo passa a 125, e outra conta mantém 20. Também foi conferida a situação em que dois nomes permitem acessar a mesma conta. A execução inicial aprovou 28 verificações Java e cinco testes do gerador; uma versão posterior aprovou nove verificações da tela. Esses resultados descrevem testes do programa, não respostas de alunos.</w:t>
       </w:r>
     </w:p>
     <w:p>
       <w:r>
-        <w:t>A análise dos antecedentes impede apresentar a simples reunião de diagrama e execução como novidade ampla. A descrição do BlueJ por Kölling et al. (2003) já inclui classes e interação com objetos. O demonstrador deste projeto deve ser examinado pelas correspondências explícitas, pelas duas condições visuais e pela rastreabilidade de seus testes. Essa delimitação permite comunicar o que foi construído sem atribuir ao projeto resultados que pertencem à literatura ou que ainda não foram obtidos.</w:t>
+        <w:t>A literatura recente justifica investigar a proposta, mas não autoriza prometer seus benefícios. Rexigel et al. (2024) destacam condições de apoio ao combinar formas de apresentação, e Sibia et al. (2026) mostram que as pessoas podem utilizar esses apoios de maneiras diferentes. Por isso, os destaques da ferramenta devem ser tratados como uma escolha a ser avaliada. O resultado de estudos externos não substitui uma avaliação própria.</w:t>
       </w:r>
     </w:p>
     <w:p>
       <w:r>
-        <w:t>Permanecem limites importantes: uma classe de exemplo, mapeamento por marcadores e ausência de avaliação humana de usabilidade e aprendizagem. Os registros técnicos informam zero participantes, portanto não permitem responder se estudantes compreenderiam melhor os conceitos. A continuidade requer revisão das fontes e dos instrumentos, confirmação das condições institucionais e avaliação apropriada. Essas etapas permitirão examinar a utilidade educacional sem confundi-la com a funcionalidade demonstrada.</w:t>
+        <w:t>O projeto permanece limitado a contas fictícias e a um conjunto pequeno de operações. Não foram avaliadas facilidade de uso, aprendizagem ou demanda comercial. A continuidade exige revisar o material com o professor, confirmar as condições de aplicação e planejar a avaliação correspondente. Essas limitações orientam os próximos passos e o alcance das conclusões.</w:t>
       </w:r>
     </w:p>
     <w:p>
@@ -547,7 +537,7 @@
         <w:jc w:val="left"/>
       </w:pPr>
       <w:r>
-        <w:t>AINSWORTH, S. DeFT: A conceptual framework for considering learning with multiple representations. Learning and Instruction, v. 16, n. 3, p. 183-198, 2006. DOI: 10.1016/j.learninstruc.2006.03.001.</w:t>
+        <w:t>JOHANNESSON, Paul; PERJONS, Erik. A Method Framework for Design Science Research. In: JOHANNESSON, Paul; PERJONS, Erik. An Introduction to Design Science. 2. ed. Cham: Springer, 2021. p. 77–93. DOI: 10.1007/978-3-030-78132-3_4.</w:t>
       </w:r>
     </w:p>
     <w:p>
@@ -555,7 +545,7 @@
         <w:jc w:val="left"/>
       </w:pPr>
       <w:r>
-        <w:t>GESTWICKI, P. V.; JAYARAMAN, B. JIVE. OOPSLA '04 Conference Companion, p. 226-227, 2004. DOI: 10.1145/1028664.1028762.</w:t>
+        <w:t>LU, Yuting; ALEXANDRU, Cristina. Systematic Review of UML Diagramming Software Tools for Higher Education Software Engineering Courses. In: CONFERENCE ON UNITED KINGDOM &amp; IRELAND COMPUTING EDUCATION RESEARCH, 2023. Proceedings [...]. New York: ACM, 2023. art. 4, p. 1–7. DOI: 10.1145/3610969.3611123.</w:t>
       </w:r>
     </w:p>
     <w:p>
@@ -563,7 +553,7 @@
         <w:jc w:val="left"/>
       </w:pPr>
       <w:r>
-        <w:t>HEVNER, A. R.; MARCH, S. T.; PARK, J.; RAM, S. Design Science in Information Systems Research. MIS Quarterly, v. 28, n. 1, 2004. DOI: 10.2307/25148625.</w:t>
+        <w:t>REXIGEL, Eva; KUHN, Jochen; BECKER, Sebastian; MALONE, Sarah. The More the Better? A Systematic Review and Meta-Analysis of the Benefits of More than Two External Representations in STEM Education. Educational Psychology Review, v. 36, art. 124, 2024. DOI: 10.1007/s10648-024-09958-y.</w:t>
       </w:r>
     </w:p>
     <w:p>
@@ -571,7 +561,7 @@
         <w:jc w:val="left"/>
       </w:pPr>
       <w:r>
-        <w:t>HUNDHAUSEN, C. D.; DOUGLAS, S. A.; STASKO, J. T. A Meta-Study of Algorithm Visualization Effectiveness. Journal of Visual Languages &amp; Computing, v. 13, n. 3, p. 259-290, 2002. DOI: 10.1006/jvlc.2002.0237.</w:t>
+        <w:t>SIBIA, Naaz et al. Code as Anchor, Memory and Metaphor as Support: Learner Experiences with Multi-View Visualizations. In: ACM CONFERENCE ON INTERNATIONAL COMPUTING EDUCATION RESEARCH, 2026. Proceedings [...]. New York: ACM, 2026. v. 1, p. 229–243. DOI: 10.1145/3765964.3811662.</w:t>
       </w:r>
     </w:p>
     <w:p>
@@ -579,15 +569,7 @@
         <w:jc w:val="left"/>
       </w:pPr>
       <w:r>
-        <w:t>KÖLLING, M.; QUIG, B.; PATTERSON, A.; ROSENBERG, J. The BlueJ system and its pedagogy. Computer Science Education, v. 13, n. 4, p. 249-268, 2003. DOI: 10.1076/csed.13.4.249.17496.</w:t>
-      </w:r>
-    </w:p>
-    <w:p>
-      <w:pPr>
-        <w:jc w:val="left"/>
-      </w:pPr>
-      <w:r>
-        <w:t>MORENO, A.; MYLLER, N.; SUTINEN, E.; BEN-ARI, M. Visualizing programs with Jeliot 3. Proceedings of the Working Conference on Advanced Visual Interfaces, p. 373-376, 2004. DOI: 10.1145/989863.989928.</w:t>
+        <w:t>YUSUF, Abdullahi; NOOR, Norah Md. Research trends on learning computer programming with program animation: A systematic mapping study. Computer Applications in Engineering Education, v. 31, n. 6, p. 1552–1582, 2023. DOI: 10.1002/cae.22659.</w:t>
       </w:r>
     </w:p>
     <w:p>

</xml_diff>

<commit_message>
docs(research): ground ABCD paragraphs in fully read source versions
Refs #1, #3, #12, #13, #14, #16. Audit 18 paragraphs, identify the author manuscript, and exclude unread sources.
</commit_message>
<xml_diff>
--- a/paper/projeto-integrador-versao-revisao.docx
+++ b/paper/projeto-integrador-versao-revisao.docx
@@ -308,17 +308,17 @@
     </w:p>
     <w:p>
       <w:r>
-        <w:t>Este Projeto Integrador apresenta uma ferramenta visual para acompanhar o que um programa faz com os dados. O exemplo usa duas contas fictícias, sem dinheiro real ou dados pessoais. Lu e Alexandru (2023) analisam ferramentas de diagramas para o ensino de desenvolvimento de programas. Neste trabalho, o desenho ajuda a apresentar a estrutura da conta; as demais partes da tela mostram as instruções escritas em Java e os valores das contas.</w:t>
+        <w:t>Relacionar diferentes formas de apresentar um conteúdo é uma questão relevante para o desenvolvimento desta ferramenta. Rexigel et al. (2024, p. 48) destacam o apoio para conectar representações. Neste Projeto Integrador, representação significa uma forma de mostrar o mesmo exemplo: desenho da conta, instruções em Java e valores registrados. A reunião dessas partes orienta a proposta, cuja utilidade educacional ainda precisa ser investigada.</w:t>
       </w:r>
     </w:p>
     <w:p>
       <w:r>
-        <w:t>Java é a linguagem usada para escrever as instruções do exemplo. Cada conta criada pelo programa é chamada de objeto; seu saldo é um dos dados guardados nela. Rexigel et al. (2024) apontam que combinar diferentes formas de apresentar um conteúdo pode trazer benefícios em certas condições, especialmente quando existe apoio para relacioná-las. Por isso, a ferramenta destaca a relação entre desenho, instruções e valores, sem presumir que esses destaques garantam aprendizagem.</w:t>
+        <w:t>A pergunta do projeto é como apresentar e conferir a relação entre instruções e mudanças nos dados de contas fictícias. Sibia et al. (2026, p. 8) observaram o uso combinado de código e memória. Aqui, uma conta começa com 100, recebe 25 e passa a 125; outra conta deve manter 20. Esse exemplo delimita a demonstração técnica, sem transferir ao nosso programa os resultados daquele estudo.</w:t>
       </w:r>
     </w:p>
     <w:p>
       <w:r>
-        <w:t>A pergunta do trabalho é: como construir uma ferramenta que mostre a relação entre as instruções de um programa e a mudança dos dados de contas de exemplo, e como conferir seu funcionamento? Um caso simples orienta essa pergunta: uma conta começa com 100, recebe 25 e deve passar a 125, enquanto a outra mantém seu valor. Os registros dos testes permitem conferir esse comportamento. O resultado disponível é uma demonstração de funcionamento; ainda não houve avaliação com estudantes.</w:t>
+        <w:t>O alcance do trabalho depende do tipo de evidência disponível. Sibia et al. (2026, p. 12) distinguem investigar o uso de visualizações de medir desempenho. No projeto, existem registros de testes do programa, mas não houve coleta com estudantes. Portanto, as conclusões desta versão tratam do funcionamento demonstrado e das perguntas ainda abertas.</w:t>
       </w:r>
     </w:p>
     <w:p>
@@ -345,7 +345,7 @@
     </w:p>
     <w:p>
       <w:r>
-        <w:t>Desenvolver e verificar uma ferramenta visual que mostre como as instruções de um programa Java alteram os dados de contas de exemplo.</w:t>
+        <w:t>Desenvolver e verificar uma ferramenta que relacione instruções Java e dados de contas de exemplo. Rexigel et al. (2024, p. 48) apontam a importância de apoio entre representações. Essa orientação será aplicada à apresentação conjunta do desenho, das instruções e dos valores. O objetivo abrange construir e conferir o recurso; não inclui comprovar aprendizagem nesta etapa.</w:t>
       </w:r>
     </w:p>
     <w:p>
@@ -361,12 +361,12 @@
     </w:p>
     <w:p>
       <w:r>
-        <w:t>Relacionar estudos recentes sobre diagramas e visualização de programas às escolhas da ferramenta.</w:t>
+        <w:t>Relacionar a literatura selecionada às escolhas de apresentação da ferramenta. Rexigel et al. (2024, p. 49) ressaltam limites de generalização entre contextos. Cada escolha será associada a uma fonte lida integralmente e ao trecho pertinente. Essa relação deverá sustentar a justificativa sem transformar resultados externos em resultados próprios.</w:t>
       </w:r>
     </w:p>
     <w:p>
       <w:r>
-        <w:t>Implementar e testar situações de alteração e compartilhamento de dados, registrando os resultados e os limites observados.</w:t>
+        <w:t>Implementar e testar situações de alteração e compartilhamento de dados, preservando os registros. Sibia et al. (2026, p. 5) apresentam visualizações de valores e referências a objetos. Aqui, serão conferidos saldos independentes e dois nomes que acessam a mesma conta. Esses testes verificarão o exemplo implementado; a avaliação com pessoas permanecerá uma etapa distinta.</w:t>
       </w:r>
     </w:p>
     <w:p>
@@ -382,22 +382,17 @@
     </w:p>
     <w:p>
       <w:r>
-        <w:t>O trabalho reuniu consulta a publicações, análise de ferramentas descritas nessas fontes, construção do programa e testes de funcionamento. Johannesson e Perjons (2021) apresentam um roteiro de pesquisa que distingue definir o problema, estabelecer requisitos, desenvolver, demonstrar e avaliar uma solução. Aqui, isso significa decidir o que a ferramenta deve mostrar e conferir se ela realiza as operações previstas. Essa aproximação não equivale a comprovar seu valor educacional.</w:t>
+        <w:t>A seleção bibliográfica foi orientada pela correspondência entre a fonte e o argumento que ela sustenta. Rexigel et al. (2024, p. 49) alertam para a dependência dos resultados em relação ao contexto. Entre as cinco referências anteriores, foram mantidas duas após leitura completa: o artigo publicado de 2024 e a versão dos autores de 2026. O registro de leitura identifica versões, páginas e exclusões; esta seleção exploratória não constitui revisão sistemática.</w:t>
       </w:r>
     </w:p>
     <w:p>
       <w:r>
-        <w:t>A busca bibliográfica foi exploratória, com recorte de publicações de 2016 até 18 de outubro de 2026 e prioridade para 2021–2026. Foram selecionadas cinco fontes de 2021, 2023, 2024 e 2026 sobre visualização, diagramas e método de pesquisa. Consultaram-se os trechos acessíveis e os resumos identificados no registro de fontes. Não se realizou uma revisão sistemática nem leitura integral de todas as obras.</w:t>
+        <w:t>A construção do exemplo adotou operações cujos efeitos podem ser acompanhados e conferidos. Sibia et al. (2026, p. 7) utilizam tarefas de acompanhamento e explicação de operações. No nosso procedimento técnico, foram criadas contas fictícias, executadas alterações e comparados valores esperados e observados. Essa aproximação orienta a apresentação do exemplo; não reproduz o estudo com participantes nem valida o programa por citação.</w:t>
       </w:r>
     </w:p>
     <w:p>
       <w:r>
-        <w:t>Na construção, foram usadas contas fictícias para representar objetos, isto é, elementos que o programa cria e cujos dados pode alterar. A tela reúne um desenho da estrutura da conta, as instruções escritas e os saldos registrados. Existem duas versões de apresentação: uma acrescenta destaques que relacionam essas partes e a outra omite os destaques. Ambas usam as mesmas operações, o que permite conferir seu comportamento e preparar uma comparação futura.</w:t>
-      </w:r>
-    </w:p>
-    <w:p>
-      <w:r>
-        <w:t>Os testes compararam valores esperados e observados. O caso de depósito verificou a passagem de 100 para 125 e a manutenção de 20 na outra conta. Também foram conferidos dois nomes para a mesma conta, operações que devem ser recusadas e a gravação dos registros em arquivo. A execução inicial aprovou 28 verificações Java e cinco testes do gerador; outra aprovou nove verificações da tela. O Apêndice A identifica essas evidências. Nenhum desses números representa quantidade de estudantes.</w:t>
+        <w:t>A verificação do programa foi separada de uma eventual avaliação de aprendizagem. Rexigel et al. (2024, p. 6–7) descrevem medidas do desempenho de estudantes. Os nossos testes verificaram saldos, acesso compartilhado, recusas de operações e exportação; o Apêndice A identifica os registros e as versões. Como não foram aplicadas tarefas a estudantes, os testes de software não permitem concluir sobre aprendizagem.</w:t>
       </w:r>
     </w:p>
     <w:p>
@@ -418,17 +413,17 @@
         <w:jc w:val="left"/>
       </w:pPr>
       <w:r>
-        <w:t>2.1 Desenhos e instruções sobre o mesmo exemplo</w:t>
+        <w:t>2.1 Formas de apresentar o mesmo exemplo</w:t>
       </w:r>
     </w:p>
     <w:p>
       <w:r>
-        <w:t>Apresentar a mesma situação de mais de uma forma pode apoiar sua compreensão, mas exige cuidado. Rexigel et al. (2024), ao reunir estudos de educação em ciências, tecnologia, engenharia e matemática, encontraram benefícios condicionados à forma de apoio oferecida. No projeto, o desenho resume o que uma conta contém, as instruções mostram a operação e os saldos mostram seu resultado. Essa aplicação é uma escolha de desenvolvimento, não uma reprodução dos resultados daqueles estudos.</w:t>
+        <w:t>Combinar formas de apresentação exige explicitar o que as relaciona. Rexigel et al. (2024, p. 9) discutem destaques e ligações entre representações. Na ferramenta, o desenho resume a conta, as instruções indicam a operação e os valores mostram seu efeito. Os destaques são uma escolha de desenvolvimento a ser avaliada, sem benefício educacional presumido.</w:t>
       </w:r>
     </w:p>
     <w:p>
       <w:r>
-        <w:t>O desenho segue uma notação chamada UML, usada para representar partes de um programa. Lu e Alexandru (2023) estudam ferramentas dessa notação para cursos superiores e discutem recursos de elaboração de diagramas e colaboração. Aqui, o desenho é limitado a uma conta de exemplo e suas operações. A fonte ajuda a situar essa escolha entre ferramentas existentes; não demonstra que o nosso recurso seja inédito ou superior.</w:t>
+        <w:t>A explicação deve permitir acompanhar as mudanças sem exigir domínio prévio do vocabulário técnico. Sibia et al. (2026, p. 5) articulam instruções, valores e referências em vistas sincronizadas. No nosso exemplo, objeto é a conta criada pelo programa, e saldo é um valor guardado nessa conta. Esses termos identificam elementos da demonstração; não representam uma descrição completa da linguagem Java.</w:t>
       </w:r>
     </w:p>
     <w:p>
@@ -437,17 +432,12 @@
         <w:jc w:val="left"/>
       </w:pPr>
       <w:r>
-        <w:t>2.2 O que o leitor precisa distinguir</w:t>
+        <w:t>2.2 Relações que a demonstração apresenta</w:t>
       </w:r>
     </w:p>
     <w:p>
       <w:r>
-        <w:t>Para entender o exemplo, é suficiente começar por três ideias: descrição, conta criada e valor guardado. A descrição reúne os dados e as operações possíveis; cada conta criada é um objeto; o saldo é um valor desse objeto. Nos testes do projeto, duas contas separadas conservam saldos independentes. Assim, alterar uma conta não deve mudar a outra.</w:t>
-      </w:r>
-    </w:p>
-    <w:p>
-      <w:r>
-        <w:t>Também pode haver dois nomes para a mesma conta. Nesse caso, não existem duas contas separadas: consultar qualquer um dos nomes permite observar o saldo do mesmo objeto. Os testes verificam essa situação e a comparam com a criação de contas independentes. Esse contraste torna a explicação concreta e delimita o comportamento que a ferramenta apresenta.</w:t>
+        <w:t>A apresentação precisa preservar as relações que pretende tornar observáveis. Sibia et al. (2026, p. 4) distinguem fidelidade conceitual de reprodução literal da memória física. Nos testes próprios, duas contas separadas mantêm saldos independentes, enquanto dois nomes da mesma conta acessam um único saldo. Esse contraste define o comportamento conferido no demonstrador, sem atribuir sua validação ao estudo citado.</w:t>
       </w:r>
     </w:p>
     <w:p>
@@ -456,17 +446,17 @@
         <w:jc w:val="left"/>
       </w:pPr>
       <w:r>
-        <w:t>2.3 Por que a utilidade precisa ser investigada</w:t>
+        <w:t>2.3 Utilidade depende de investigação</w:t>
       </w:r>
     </w:p>
     <w:p>
       <w:r>
-        <w:t>Mostrar várias partes de um programa na tela não garante que todas sejam utilizadas. Sibia et al. (2026) investigaram o uso de visualizações por universitários que já haviam cursado disciplinas introdutórias e identificaram diferenças nas formas de recorrer a esses apoios. Isso orienta uma pergunta para o nosso projeto: os destaques seriam úteis ao público pretendido? Como esse público ainda não foi avaliado, a resposta permanece aberta.</w:t>
+        <w:t>Uma apresentação visual pode ser recebida de maneiras diferentes pelas pessoas. Sibia et al. (2026, p. 9–10) relatam reações divergentes às mesmas metáforas. Assim, pretendemos investigar se os destaques do nosso exemplo ajudam o público escolhido ou dificultam sua leitura. A questão permanece aberta porque esse público ainda não utilizou a ferramenta em uma avaliação.</w:t>
       </w:r>
     </w:p>
     <w:p>
       <w:r>
-        <w:t>Os resultados de outras pesquisas também não são uniformes. Yusuf e Noor (2023), em um mapeamento sobre animação de programas, relatam resultados variados e maior concentração de estudos no ensino superior. Portanto, um resultado favorável em outro curso não pode ser tratado como resultado deste Projeto Integrador. Será necessário observar o uso da ferramenta no contexto em que ela venha a ser aplicada.</w:t>
+        <w:t>Os resultados de outras pesquisas exigem cautela ao justificar uma nova ferramenta. Rexigel et al. (2024, p. 28) relatam também resultados sem diferença de aprendizagem. Por isso, apresentar desenho, instruções e saldos constitui uma proposta fundamentada, cujo efeito local é desconhecido. A literatura sustenta investigá-la, sem estabelecer superioridade sobre outras ferramentas.</w:t>
       </w:r>
     </w:p>
     <w:p>
@@ -475,17 +465,12 @@
         <w:jc w:val="left"/>
       </w:pPr>
       <w:r>
-        <w:t>2.4 Funcionamento e aprendizagem são resultados distintos</w:t>
+        <w:t>2.4 Funcionamento, aprendizagem e comunicação pública</w:t>
       </w:r>
     </w:p>
     <w:p>
       <w:r>
-        <w:t>Demonstrar uma solução e avaliar seus resultados são atividades que precisam ser explicitadas. Johannesson e Perjons (2021) distinguem essas atividades em seu roteiro de pesquisa. Neste trabalho, conferir que 100 mais 25 resulta em 125 mostra o funcionamento de uma operação. Para investigar aprendizagem, seria preciso verificar o que as pessoas conseguem explicar ou fazer após usar a ferramenta.</w:t>
-      </w:r>
-    </w:p>
-    <w:p>
-      <w:r>
-        <w:t>A apresentação pública do programa deve acompanhar as evidências obtidas. Os registros disponíveis mostram testes de funcionamento, sem avaliação com estudantes e sem pesquisa de vendas. É possível apresentar o recurso como uma ferramenta visual para acompanhar contas de exemplo. Afirmar que ele melhora notas ou desperta interesse de compra dependeria de dados que ainda não foram coletados.</w:t>
+        <w:t>O que se comunica sobre a ferramenta deve acompanhar o que foi efetivamente investigado. Sibia et al. (2026, p. 12) limitam suas conclusões e não analisam desempenho como resultado. Neste projeto, podemos demonstrar operações e informar os testes próprios; não há dados de aprendizagem nem de intenção de compra. Assim, benefícios educacionais e aceitação comercial continuam como perguntas para pesquisas futuras.</w:t>
       </w:r>
     </w:p>
     <w:p>
@@ -502,22 +487,17 @@
     </w:p>
     <w:p>
       <w:r>
-        <w:t>Foi construída uma ferramenta que relaciona o desenho de uma conta, as instruções de um programa Java e os valores registrados durante seu funcionamento. Os testes preservados conferem operações específicas, como alterar uma conta sem mudar outra conta separada. Isso responde à pergunta técnica dentro do exemplo desenvolvido. O trabalho ainda não responde se a ferramenta facilita a aprendizagem.</w:t>
+        <w:t>O trabalho produziu uma demonstração que relaciona desenho, instruções Java e valores de contas fictícias. Rexigel et al. (2024, p. 48) fundamentam investigar apoios entre representações. A implementação aplica essa orientação e possui registros próprios de verificação técnica, identificados no Apêndice A. Isso descreve o resultado desenvolvido, sem comprovar que ele facilite aprender programação.</w:t>
       </w:r>
     </w:p>
     <w:p>
       <w:r>
-        <w:t>O principal resultado pode ser explicado sem conhecer programação: quando uma conta com 100 recebe 25, seu saldo passa a 125, e outra conta mantém 20. Também foi conferida a situação em que dois nomes permitem acessar a mesma conta. A execução inicial aprovou 28 verificações Java e cinco testes do gerador; uma versão posterior aprovou nove verificações da tela. Esses resultados descrevem testes do programa, não respostas de alunos.</w:t>
+        <w:t>O resultado técnico tem alcance restrito ao exemplo e às operações conferidas. Sibia et al. (2026, p. 12) delimitam seus achados a um contexto específico. No nosso caso, foi conferida a passagem de 100 para 125, mantendo 20 em outra conta, além do acesso compartilhado à mesma conta. Esses registros sustentam somente o funcionamento observado nas versões testadas.</w:t>
       </w:r>
     </w:p>
     <w:p>
       <w:r>
-        <w:t>A literatura recente justifica investigar a proposta, mas não autoriza prometer seus benefícios. Rexigel et al. (2024) destacam condições de apoio ao combinar formas de apresentação, e Sibia et al. (2026) mostram que as pessoas podem utilizar esses apoios de maneiras diferentes. Por isso, os destaques da ferramenta devem ser tratados como uma escolha a ser avaliada. O resultado de estudos externos não substitui uma avaliação própria.</w:t>
-      </w:r>
-    </w:p>
-    <w:p>
-      <w:r>
-        <w:t>O projeto permanece limitado a contas fictícias e a um conjunto pequeno de operações. Não foram avaliadas facilidade de uso, aprendizagem ou demanda comercial. A continuidade exige revisar o material com o professor, confirmar as condições de aplicação e planejar a avaliação correspondente. Essas limitações orientam os próximos passos e o alcance das conclusões.</w:t>
+        <w:t>A continuidade depende de investigar como o público utilizará a ferramenta. Sibia et al. (2026, p. 12–13) reconhecem que a transferência de seus achados permanece aberta. O próximo passo proposto é revisar o material com o professor e definir tarefas e condições para uma futura avaliação. Até sua realização, permanecem sem resposta a compreensão por leigos, a aprendizagem e a demanda comercial.</w:t>
       </w:r>
     </w:p>
     <w:p>
@@ -537,7 +517,7 @@
         <w:jc w:val="left"/>
       </w:pPr>
       <w:r>
-        <w:t>JOHANNESSON, Paul; PERJONS, Erik. A Method Framework for Design Science Research. In: JOHANNESSON, Paul; PERJONS, Erik. An Introduction to Design Science. 2. ed. Cham: Springer, 2021. p. 77–93. DOI: 10.1007/978-3-030-78132-3_4.</w:t>
+        <w:t>REXIGEL, Eva; KUHN, Jochen; BECKER, Sebastian; MALONE, Sarah. The More the Better? A Systematic Review and Meta-Analysis of the Benefits of More than Two External Representations in STEM Education. Educational Psychology Review, v. 36, art. 124, 2024. DOI: 10.1007/s10648-024-09958-y. Disponível em: https://doi.org/10.1007/s10648-024-09958-y. Acesso em: 18 out. 2026.</w:t>
       </w:r>
     </w:p>
     <w:p>
@@ -545,31 +525,7 @@
         <w:jc w:val="left"/>
       </w:pPr>
       <w:r>
-        <w:t>LU, Yuting; ALEXANDRU, Cristina. Systematic Review of UML Diagramming Software Tools for Higher Education Software Engineering Courses. In: CONFERENCE ON UNITED KINGDOM &amp; IRELAND COMPUTING EDUCATION RESEARCH, 2023. Proceedings [...]. New York: ACM, 2023. art. 4, p. 1–7. DOI: 10.1145/3610969.3611123.</w:t>
-      </w:r>
-    </w:p>
-    <w:p>
-      <w:pPr>
-        <w:jc w:val="left"/>
-      </w:pPr>
-      <w:r>
-        <w:t>REXIGEL, Eva; KUHN, Jochen; BECKER, Sebastian; MALONE, Sarah. The More the Better? A Systematic Review and Meta-Analysis of the Benefits of More than Two External Representations in STEM Education. Educational Psychology Review, v. 36, art. 124, 2024. DOI: 10.1007/s10648-024-09958-y.</w:t>
-      </w:r>
-    </w:p>
-    <w:p>
-      <w:pPr>
-        <w:jc w:val="left"/>
-      </w:pPr>
-      <w:r>
-        <w:t>SIBIA, Naaz et al. Code as Anchor, Memory and Metaphor as Support: Learner Experiences with Multi-View Visualizations. In: ACM CONFERENCE ON INTERNATIONAL COMPUTING EDUCATION RESEARCH, 2026. Proceedings [...]. New York: ACM, 2026. v. 1, p. 229–243. DOI: 10.1145/3765964.3811662.</w:t>
-      </w:r>
-    </w:p>
-    <w:p>
-      <w:pPr>
-        <w:jc w:val="left"/>
-      </w:pPr>
-      <w:r>
-        <w:t>YUSUF, Abdullahi; NOOR, Norah Md. Research trends on learning computer programming with program animation: A systematic mapping study. Computer Applications in Engineering Education, v. 31, n. 6, p. 1552–1582, 2023. DOI: 10.1002/cae.22659.</w:t>
+        <w:t>SIBIA, Naaz et al. Code as Anchor, Memory and Metaphor as Support: Learner Experiences with Multi-View Visualizations. arXiv, versão 1, 17 jun. 2026. 15 p. Versão dos autores; identificada como trabalho do ICER 2026 no PDF. DOI da versão consultada: 10.48550/arXiv.2606.19570. Disponível em: https://arxiv.org/abs/2606.19570v1. Acesso em: 18 out. 2026.</w:t>
       </w:r>
     </w:p>
     <w:p>
@@ -584,54 +540,270 @@
       </w:r>
       <w:bookmarkEnd w:id="9"/>
     </w:p>
-    <w:p>
-      <w:r>
-        <w:t>O demonstrador está em prototype/ no repositório aloisiocosta-professor/trama-ide-web. Os testes usam dados de exemplo, sem registros de pessoas participantes. Os números abaixo representam verificações de software, não quantidade de estudantes.</w:t>
-      </w:r>
-    </w:p>
-    <w:p>
-      <w:pPr>
-        <w:pStyle w:val="Heading2"/>
-        <w:jc w:val="left"/>
-      </w:pPr>
-      <w:r>
-        <w:t>Cenários e resultados</w:t>
-      </w:r>
-    </w:p>
-    <w:p>
-      <w:r>
-        <w:t>A execução inicial 39083293325 do GitHub Actions corresponde ao commit 5cf946e5a77439c3c41759536c006d6d8a2e3810. Nela passaram 28 verificações Java e cinco testes Python do gerador. A execução 39104951676 corresponde ao commit 89a84aa3132eb6c369a2dfe7ff2057716fe4b0df e acrescenta nove verificações gráficas de janela, controles, legibilidade, respostas e exportação. Os dois conjuntos são evidências de versões diferentes, preservadas separadamente.</w:t>
-      </w:r>
-    </w:p>
-    <w:p>
-      <w:r>
-        <w:t>O cenário principal cria duas contas, seleciona uma delas, registra uma previsão e executa um depósito de 25 sobre um saldo inicial de 100. O saldo dessa conta passa a 125, enquanto a outra instância mantém seu saldo de 20. Os testes também conferem alias e rejeições; o cenário principal não representa todos os comportamentos possíveis.</w:t>
-      </w:r>
-    </w:p>
-    <w:p>
-      <w:pPr>
-        <w:pStyle w:val="Heading2"/>
-        <w:jc w:val="left"/>
-      </w:pPr>
-      <w:r>
-        <w:t>Como conferir as evidências</w:t>
-      </w:r>
-    </w:p>
-    <w:p>
-      <w:r>
-        <w:t>O comando python tools/build_research.py requer JDK 17, Python e xvfb-run para as verificações gráficas em Linux. Os logs, resultados e imagens das execuções citadas estão em docs/research/evidence/ci-5cf946/ e docs/research/evidence/ci-89a84a/. O README do protótipo documenta execução interativa e limitações. A compilação foi verificada no ambiente remoto descrito nos logs.</w:t>
-      </w:r>
-    </w:p>
-    <w:p>
-      <w:r>
-        <w:t>Repositório: https://github.com/aloisiocosta-professor/trama-ide-web/tree/docs/research-bootstrap . Execuções: https://github.com/aloisiocosta-professor/trama-ide-web/actions/runs/39083293325 e https://github.com/aloisiocosta-professor/trama-ide-web/actions/runs/39104951676 .</w:t>
-      </w:r>
-    </w:p>
-    <w:p>
-      <w:r>
-        <w:t>Houve assistência de inteligência artificial na organização textual e no desenvolvimento dos materiais. Cabe aos autores conferir fontes, compreender o funcionamento, revisar o texto e assumir responsabilidade pela entrega. A forma de declaração deve observar as regras da escola.</w:t>
-      </w:r>
-    </w:p>
+    <w:tbl>
+      <w:tblPr>
+        <w:tblStyle w:val="TableGrid"/>
+        <w:tblW w:type="auto" w:w="0"/>
+        <w:tblLayout w:type="fixed"/>
+        <w:tblLook w:firstColumn="1" w:firstRow="1" w:lastColumn="0" w:lastRow="0" w:noHBand="0" w:noVBand="1" w:val="04A0"/>
+      </w:tblPr>
+      <w:tblGrid>
+        <w:gridCol w:w="1871"/>
+        <w:gridCol w:w="7767"/>
+      </w:tblGrid>
+      <w:tr>
+        <w:trPr>
+          <w:cantSplit/>
+        </w:trPr>
+        <w:tc>
+          <w:tcPr>
+            <w:tcW w:type="dxa" w:w="1871"/>
+          </w:tcPr>
+          <w:p>
+            <w:pPr>
+              <w:spacing w:after="80" w:line="360" w:lineRule="auto"/>
+              <w:jc w:val="left"/>
+            </w:pPr>
+            <w:r>
+              <w:rPr>
+                <w:b/>
+              </w:rPr>
+              <w:t>Natureza</w:t>
+            </w:r>
+          </w:p>
+        </w:tc>
+        <w:tc>
+          <w:tcPr>
+            <w:tcW w:type="dxa" w:w="7767"/>
+          </w:tcPr>
+          <w:p>
+            <w:pPr>
+              <w:spacing w:after="80" w:line="360" w:lineRule="auto"/>
+              <w:jc w:val="left"/>
+            </w:pPr>
+            <w:r>
+              <w:t>Registros próprios de testes de software, com contas fictícias e sem participantes. Os números não representam estudantes.</w:t>
+            </w:r>
+          </w:p>
+        </w:tc>
+      </w:tr>
+      <w:tr>
+        <w:trPr>
+          <w:cantSplit/>
+        </w:trPr>
+        <w:tc>
+          <w:tcPr>
+            <w:tcW w:type="dxa" w:w="1871"/>
+          </w:tcPr>
+          <w:p>
+            <w:pPr>
+              <w:spacing w:after="80" w:line="360" w:lineRule="auto"/>
+              <w:jc w:val="left"/>
+            </w:pPr>
+            <w:r>
+              <w:rPr>
+                <w:b/>
+              </w:rPr>
+              <w:t>Versão inicial</w:t>
+            </w:r>
+          </w:p>
+        </w:tc>
+        <w:tc>
+          <w:tcPr>
+            <w:tcW w:type="dxa" w:w="7767"/>
+          </w:tcPr>
+          <w:p>
+            <w:pPr>
+              <w:spacing w:after="80" w:line="360" w:lineRule="auto"/>
+              <w:jc w:val="left"/>
+            </w:pPr>
+            <w:r>
+              <w:t>Execução 39083293325; commit 5cf946e5a77439c3c41759536c006d6d8a2e3810. Aprovadas 28 verificações Java e cinco testes Python do gerador. Evidências: docs/research/evidence/ci-5cf946/.</w:t>
+            </w:r>
+          </w:p>
+        </w:tc>
+      </w:tr>
+      <w:tr>
+        <w:trPr>
+          <w:cantSplit/>
+        </w:trPr>
+        <w:tc>
+          <w:tcPr>
+            <w:tcW w:type="dxa" w:w="1871"/>
+          </w:tcPr>
+          <w:p>
+            <w:pPr>
+              <w:spacing w:after="80" w:line="360" w:lineRule="auto"/>
+              <w:jc w:val="left"/>
+            </w:pPr>
+            <w:r>
+              <w:rPr>
+                <w:b/>
+              </w:rPr>
+              <w:t>Versão posterior</w:t>
+            </w:r>
+          </w:p>
+        </w:tc>
+        <w:tc>
+          <w:tcPr>
+            <w:tcW w:type="dxa" w:w="7767"/>
+          </w:tcPr>
+          <w:p>
+            <w:pPr>
+              <w:spacing w:after="80" w:line="360" w:lineRule="auto"/>
+              <w:jc w:val="left"/>
+            </w:pPr>
+            <w:r>
+              <w:t>Execução 39104951676; commit 89a84aa3132eb6c369a2dfe7ff2057716fe4b0df. Aprovadas nove verificações de interface e exportação. Evidências: docs/research/evidence/ci-89a84a/. São versões distintas.</w:t>
+            </w:r>
+          </w:p>
+        </w:tc>
+      </w:tr>
+      <w:tr>
+        <w:trPr>
+          <w:cantSplit/>
+        </w:trPr>
+        <w:tc>
+          <w:tcPr>
+            <w:tcW w:type="dxa" w:w="1871"/>
+          </w:tcPr>
+          <w:p>
+            <w:pPr>
+              <w:spacing w:after="80" w:line="360" w:lineRule="auto"/>
+              <w:jc w:val="left"/>
+            </w:pPr>
+            <w:r>
+              <w:rPr>
+                <w:b/>
+              </w:rPr>
+              <w:t>Cenários</w:t>
+            </w:r>
+          </w:p>
+        </w:tc>
+        <w:tc>
+          <w:tcPr>
+            <w:tcW w:type="dxa" w:w="7767"/>
+          </w:tcPr>
+          <w:p>
+            <w:pPr>
+              <w:spacing w:after="80" w:line="360" w:lineRule="auto"/>
+              <w:jc w:val="left"/>
+            </w:pPr>
+            <w:r>
+              <w:t>Depósito de 25 sobre 100: saldo 125; outra conta mantém 20. Também foram conferidos dois nomes para a mesma conta e recusas de operações. O conjunto é restrito aos casos testados.</w:t>
+            </w:r>
+          </w:p>
+        </w:tc>
+      </w:tr>
+      <w:tr>
+        <w:trPr>
+          <w:cantSplit/>
+        </w:trPr>
+        <w:tc>
+          <w:tcPr>
+            <w:tcW w:type="dxa" w:w="1871"/>
+          </w:tcPr>
+          <w:p>
+            <w:pPr>
+              <w:spacing w:after="80" w:line="360" w:lineRule="auto"/>
+              <w:jc w:val="left"/>
+            </w:pPr>
+            <w:r>
+              <w:rPr>
+                <w:b/>
+              </w:rPr>
+              <w:t>Reprodução</w:t>
+            </w:r>
+          </w:p>
+        </w:tc>
+        <w:tc>
+          <w:tcPr>
+            <w:tcW w:type="dxa" w:w="7767"/>
+          </w:tcPr>
+          <w:p>
+            <w:pPr>
+              <w:spacing w:after="80" w:line="360" w:lineRule="auto"/>
+              <w:jc w:val="left"/>
+            </w:pPr>
+            <w:r>
+              <w:t>Comando: python tools/build_research.py. Requisitos: JDK 17, Python e xvfb-run em Linux. Orientações interativas e limites: prototype/README.md. Ambiente remoto identificado nos logs preservados.</w:t>
+            </w:r>
+          </w:p>
+        </w:tc>
+      </w:tr>
+      <w:tr>
+        <w:trPr>
+          <w:cantSplit/>
+        </w:trPr>
+        <w:tc>
+          <w:tcPr>
+            <w:tcW w:type="dxa" w:w="1871"/>
+          </w:tcPr>
+          <w:p>
+            <w:pPr>
+              <w:spacing w:after="80" w:line="360" w:lineRule="auto"/>
+              <w:jc w:val="left"/>
+            </w:pPr>
+            <w:r>
+              <w:rPr>
+                <w:b/>
+              </w:rPr>
+              <w:t>Localização</w:t>
+            </w:r>
+          </w:p>
+        </w:tc>
+        <w:tc>
+          <w:tcPr>
+            <w:tcW w:type="dxa" w:w="7767"/>
+          </w:tcPr>
+          <w:p>
+            <w:pPr>
+              <w:spacing w:after="80" w:line="360" w:lineRule="auto"/>
+              <w:jc w:val="left"/>
+            </w:pPr>
+            <w:r>
+              <w:t>Repositório: https://github.com/aloisiocosta-professor/trama-ide-web/tree/docs/research-bootstrap . Execuções disponíveis na aba Actions pelos números acima.</w:t>
+            </w:r>
+          </w:p>
+        </w:tc>
+      </w:tr>
+      <w:tr>
+        <w:trPr>
+          <w:cantSplit/>
+        </w:trPr>
+        <w:tc>
+          <w:tcPr>
+            <w:tcW w:type="dxa" w:w="1871"/>
+          </w:tcPr>
+          <w:p>
+            <w:pPr>
+              <w:spacing w:after="80" w:line="360" w:lineRule="auto"/>
+              <w:jc w:val="left"/>
+            </w:pPr>
+            <w:r>
+              <w:rPr>
+                <w:b/>
+              </w:rPr>
+              <w:t>Autoria e apoio</w:t>
+            </w:r>
+          </w:p>
+        </w:tc>
+        <w:tc>
+          <w:tcPr>
+            <w:tcW w:type="dxa" w:w="7767"/>
+          </w:tcPr>
+          <w:p>
+            <w:pPr>
+              <w:spacing w:after="80" w:line="360" w:lineRule="auto"/>
+              <w:jc w:val="left"/>
+            </w:pPr>
+            <w:r>
+              <w:t>Houve assistência de inteligência artificial na organização textual e nos materiais. Conferência, compreensão e responsabilidade pela entrega cabem aos autores, observadas as regras da escola.</w:t>
+            </w:r>
+          </w:p>
+        </w:tc>
+      </w:tr>
+    </w:tbl>
     <w:p>
       <w:bookmarkStart w:id="10" w:name="anexos"/>
       <w:pPr>
@@ -644,11 +816,126 @@
       </w:r>
       <w:bookmarkEnd w:id="10"/>
     </w:p>
-    <w:p>
-      <w:r>
-        <w:t>Não foram incorporados documentos de terceiros ao corpo desta versão. O modelo institucional enviado orientou a estrutura e a formatação. As fontes bibliográficas utilizadas estão identificadas nas referências; seus textos integrais não foram reproduzidos.</w:t>
-      </w:r>
-    </w:p>
+    <w:tbl>
+      <w:tblPr>
+        <w:tblStyle w:val="TableGrid"/>
+        <w:tblW w:type="auto" w:w="0"/>
+        <w:tblLayout w:type="fixed"/>
+        <w:tblLook w:firstColumn="1" w:firstRow="1" w:lastColumn="0" w:lastRow="0" w:noHBand="0" w:noVBand="1" w:val="04A0"/>
+      </w:tblPr>
+      <w:tblGrid>
+        <w:gridCol w:w="1871"/>
+        <w:gridCol w:w="7767"/>
+      </w:tblGrid>
+      <w:tr>
+        <w:trPr>
+          <w:cantSplit/>
+        </w:trPr>
+        <w:tc>
+          <w:tcPr>
+            <w:tcW w:type="dxa" w:w="1871"/>
+          </w:tcPr>
+          <w:p>
+            <w:pPr>
+              <w:spacing w:after="80" w:line="360" w:lineRule="auto"/>
+              <w:jc w:val="left"/>
+            </w:pPr>
+            <w:r>
+              <w:rPr>
+                <w:b/>
+              </w:rPr>
+              <w:t>Modelo</w:t>
+            </w:r>
+          </w:p>
+        </w:tc>
+        <w:tc>
+          <w:tcPr>
+            <w:tcW w:type="dxa" w:w="7767"/>
+          </w:tcPr>
+          <w:p>
+            <w:pPr>
+              <w:spacing w:after="80" w:line="360" w:lineRule="auto"/>
+              <w:jc w:val="left"/>
+            </w:pPr>
+            <w:r>
+              <w:t>A estrutura foi orientada pelo modelo enviado, preservado como paper/modelo-entrega-original.docx.</w:t>
+            </w:r>
+          </w:p>
+        </w:tc>
+      </w:tr>
+      <w:tr>
+        <w:trPr>
+          <w:cantSplit/>
+        </w:trPr>
+        <w:tc>
+          <w:tcPr>
+            <w:tcW w:type="dxa" w:w="1871"/>
+          </w:tcPr>
+          <w:p>
+            <w:pPr>
+              <w:spacing w:after="80" w:line="360" w:lineRule="auto"/>
+              <w:jc w:val="left"/>
+            </w:pPr>
+            <w:r>
+              <w:rPr>
+                <w:b/>
+              </w:rPr>
+              <w:t>Fontes externas</w:t>
+            </w:r>
+          </w:p>
+        </w:tc>
+        <w:tc>
+          <w:tcPr>
+            <w:tcW w:type="dxa" w:w="7767"/>
+          </w:tcPr>
+          <w:p>
+            <w:pPr>
+              <w:spacing w:after="80" w:line="360" w:lineRule="auto"/>
+              <w:jc w:val="left"/>
+            </w:pPr>
+            <w:r>
+              <w:t>Os PDFs dos artigos não foram incorporados ao trabalho. A versão efetivamente consultada está identificada nas referências e no registro de leitura.</w:t>
+            </w:r>
+          </w:p>
+        </w:tc>
+      </w:tr>
+      <w:tr>
+        <w:trPr>
+          <w:cantSplit/>
+        </w:trPr>
+        <w:tc>
+          <w:tcPr>
+            <w:tcW w:type="dxa" w:w="1871"/>
+          </w:tcPr>
+          <w:p>
+            <w:pPr>
+              <w:spacing w:after="80" w:line="360" w:lineRule="auto"/>
+              <w:jc w:val="left"/>
+            </w:pPr>
+            <w:r>
+              <w:rPr>
+                <w:b/>
+              </w:rPr>
+              <w:t>Identificação</w:t>
+            </w:r>
+          </w:p>
+        </w:tc>
+        <w:tc>
+          <w:tcPr>
+            <w:tcW w:type="dxa" w:w="7767"/>
+          </w:tcPr>
+          <w:p>
+            <w:pPr>
+              <w:spacing w:after="80" w:line="360" w:lineRule="auto"/>
+              <w:jc w:val="left"/>
+            </w:pPr>
+            <w:r>
+              <w:t>Escola, curso específico, alunos, professor e cidade aguardam confirmação. Este arquivo é uma versão para revisão.</w:t>
+            </w:r>
+          </w:p>
+        </w:tc>
+      </w:tr>
+    </w:tbl>
     <w:sectPr>
       <w:pgSz w:w="11906" w:h="16838"/>
       <w:pgMar w:top="1134" w:right="1134" w:bottom="1134" w:left="1134" w:header="720" w:footer="720" w:gutter="0"/>
@@ -1023,6 +1310,7 @@
     <w:qFormat/>
     <w:rsid w:val="00FC693F"/>
     <w:pPr>
+      <w:keepLines/>
       <w:spacing w:line="360" w:lineRule="auto" w:after="120"/>
       <w:jc w:val="both"/>
     </w:pPr>

</xml_diff>